<commit_message>
update app, prompts, observation, app.py
</commit_message>
<xml_diff>
--- a/docs/Doc1 real testing.docx
+++ b/docs/Doc1 real testing.docx
@@ -1,6 +1,6 @@
 
 <file path=word/document.xml><?xml version="1.0" encoding="utf-8"?>
-<w:document xmlns:wpc="http://schemas.microsoft.com/office/word/2010/wordprocessingCanvas" xmlns:cx="http://schemas.microsoft.com/office/drawing/2014/chartex" xmlns:cx1="http://schemas.microsoft.com/office/drawing/2015/9/8/chartex" xmlns:cx2="http://schemas.microsoft.com/office/drawing/2015/10/21/chartex" xmlns:cx3="http://schemas.microsoft.com/office/drawing/2016/5/9/chartex" xmlns:cx4="http://schemas.microsoft.com/office/drawing/2016/5/10/chartex" xmlns:cx5="http://schemas.microsoft.com/office/drawing/2016/5/11/chartex" xmlns:cx6="http://schemas.microsoft.com/office/drawing/2016/5/12/chartex" xmlns:cx7="http://schemas.microsoft.com/office/drawing/2016/5/13/chartex" xmlns:cx8="http://schemas.microsoft.com/office/drawing/2016/5/14/chartex" xmlns:mc="http://schemas.openxmlformats.org/markup-compatibility/2006" xmlns:aink="http://schemas.microsoft.com/office/drawing/2016/ink" xmlns:am3d="http://schemas.microsoft.com/office/drawing/2017/model3d" xmlns:o="urn:schemas-microsoft-com:office:office" xmlns:oel="http://schemas.microsoft.com/office/2019/extlst" xmlns:r="http://schemas.openxmlformats.org/officeDocument/2006/relationships" xmlns:m="http://schemas.openxmlformats.org/officeDocument/2006/math" xmlns:v="urn:schemas-microsoft-com:vml" xmlns:wp14="http://schemas.microsoft.com/office/word/2010/wordprocessingDrawing" xmlns:wp="http://schemas.openxmlformats.org/drawingml/2006/wordprocessingDrawing" xmlns:w10="urn:schemas-microsoft-com:office:word" xmlns:w="http://schemas.openxmlformats.org/wordprocessingml/2006/main" xmlns:w14="http://schemas.microsoft.com/office/word/2010/wordml" xmlns:w15="http://schemas.microsoft.com/office/word/2012/wordml" xmlns:w16cex="http://schemas.microsoft.com/office/word/2018/wordml/cex" xmlns:w16cid="http://schemas.microsoft.com/office/word/2016/wordml/cid" xmlns:w16="http://schemas.microsoft.com/office/word/2018/wordml" xmlns:w16du="http://schemas.microsoft.com/office/word/2023/wordml/word16du" xmlns:w16sdtdh="http://schemas.microsoft.com/office/word/2020/wordml/sdtdatahash" xmlns:w16sdtfl="http://schemas.microsoft.com/office/word/2024/wordml/sdtformatlock" xmlns:w16se="http://schemas.microsoft.com/office/word/2015/wordml/symex" xmlns:wpg="http://schemas.microsoft.com/office/word/2010/wordprocessingGroup" xmlns:wpi="http://schemas.microsoft.com/office/word/2010/wordprocessingInk" xmlns:wne="http://schemas.microsoft.com/office/word/2006/wordml" xmlns:wps="http://schemas.microsoft.com/office/word/2010/wordprocessingShape" mc:Ignorable="w14 w15 w16se w16cid w16 w16cex w16sdtdh w16sdtfl w16du wp14">
+<w:document xmlns:wpc="http://schemas.microsoft.com/office/word/2010/wordprocessingCanvas" xmlns:cx="http://schemas.microsoft.com/office/drawing/2014/chartex" xmlns:cx1="http://schemas.microsoft.com/office/drawing/2015/9/8/chartex" xmlns:cx2="http://schemas.microsoft.com/office/drawing/2015/10/21/chartex" xmlns:cx3="http://schemas.microsoft.com/office/drawing/2016/5/9/chartex" xmlns:cx4="http://schemas.microsoft.com/office/drawing/2016/5/10/chartex" xmlns:cx5="http://schemas.microsoft.com/office/drawing/2016/5/11/chartex" xmlns:cx6="http://schemas.microsoft.com/office/drawing/2016/5/12/chartex" xmlns:cx7="http://schemas.microsoft.com/office/drawing/2016/5/13/chartex" xmlns:cx8="http://schemas.microsoft.com/office/drawing/2016/5/14/chartex" xmlns:mc="http://schemas.openxmlformats.org/markup-compatibility/2006" xmlns:aink="http://schemas.microsoft.com/office/drawing/2016/ink" xmlns:am3d="http://schemas.microsoft.com/office/drawing/2017/model3d" xmlns:o="urn:schemas-microsoft-com:office:office" xmlns:oel="http://schemas.microsoft.com/office/2019/extlst" xmlns:r="http://schemas.openxmlformats.org/officeDocument/2006/relationships" xmlns:m="http://schemas.openxmlformats.org/officeDocument/2006/math" xmlns:v="urn:schemas-microsoft-com:vml" xmlns:wp14="http://schemas.microsoft.com/office/word/2010/wordprocessingDrawing" xmlns:wp="http://schemas.openxmlformats.org/drawingml/2006/wordprocessingDrawing" xmlns:w10="urn:schemas-microsoft-com:office:word" xmlns:w="http://schemas.openxmlformats.org/wordprocessingml/2006/main" xmlns:w14="http://schemas.microsoft.com/office/word/2010/wordml" xmlns:w15="http://schemas.microsoft.com/office/word/2012/wordml" xmlns:w16cei="http://schemas.microsoft.com/office/word/2026/wordml/cei" xmlns:w16cex="http://schemas.microsoft.com/office/word/2018/wordml/cex" xmlns:w16cid="http://schemas.microsoft.com/office/word/2016/wordml/cid" xmlns:w16="http://schemas.microsoft.com/office/word/2018/wordml" xmlns:w16du="http://schemas.microsoft.com/office/word/2023/wordml/word16du" xmlns:w16sdtdh="http://schemas.microsoft.com/office/word/2020/wordml/sdtdatahash" xmlns:w16sdtfl="http://schemas.microsoft.com/office/word/2024/wordml/sdtformatlock" xmlns:w16se="http://schemas.microsoft.com/office/word/2015/wordml/symex" xmlns:wpg="http://schemas.microsoft.com/office/word/2010/wordprocessingGroup" xmlns:wpi="http://schemas.microsoft.com/office/word/2010/wordprocessingInk" xmlns:wne="http://schemas.microsoft.com/office/word/2006/wordml" xmlns:wps="http://schemas.microsoft.com/office/word/2010/wordprocessingShape" mc:Ignorable="w14 w15 w16se w16cid w16 w16cex w16sdtdh w16sdtfl w16du wp14">
   <w:body>
     <w:p/>
     <w:p>
@@ -419,7 +419,7 @@
     <w:p>
       <w:r>
         <w:pict w14:anchorId="40D0DCF4">
-          <v:rect id="_x0000_i1085" style="width:0;height:1.5pt" o:hralign="center" o:hrstd="t" o:hr="t" fillcolor="#a0a0a0" stroked="f"/>
+          <v:rect id="_x0000_i1025" style="width:0;height:1.5pt" o:hralign="center" o:hrstd="t" o:hr="t" fillcolor="#a0a0a0" stroked="f"/>
         </w:pict>
       </w:r>
     </w:p>
@@ -515,7 +515,7 @@
     <w:p>
       <w:r>
         <w:pict w14:anchorId="27B95CC7">
-          <v:rect id="_x0000_i1086" style="width:0;height:1.5pt" o:hralign="center" o:hrstd="t" o:hr="t" fillcolor="#a0a0a0" stroked="f"/>
+          <v:rect id="_x0000_i1026" style="width:0;height:1.5pt" o:hralign="center" o:hrstd="t" o:hr="t" fillcolor="#a0a0a0" stroked="f"/>
         </w:pict>
       </w:r>
     </w:p>
@@ -647,7 +647,7 @@
     <w:p>
       <w:r>
         <w:pict w14:anchorId="0D28FEF6">
-          <v:rect id="_x0000_i1087" style="width:0;height:1.5pt" o:hralign="center" o:hrstd="t" o:hr="t" fillcolor="#a0a0a0" stroked="f"/>
+          <v:rect id="_x0000_i1027" style="width:0;height:1.5pt" o:hralign="center" o:hrstd="t" o:hr="t" fillcolor="#a0a0a0" stroked="f"/>
         </w:pict>
       </w:r>
     </w:p>
@@ -708,7 +708,7 @@
     <w:p>
       <w:r>
         <w:pict w14:anchorId="78C9CD79">
-          <v:rect id="_x0000_i1088" style="width:0;height:1.5pt" o:hralign="center" o:hrstd="t" o:hr="t" fillcolor="#a0a0a0" stroked="f"/>
+          <v:rect id="_x0000_i1028" style="width:0;height:1.5pt" o:hralign="center" o:hrstd="t" o:hr="t" fillcolor="#a0a0a0" stroked="f"/>
         </w:pict>
       </w:r>
     </w:p>
@@ -816,7 +816,7 @@
     <w:p>
       <w:r>
         <w:pict w14:anchorId="70DC9E4E">
-          <v:rect id="_x0000_i1089" style="width:0;height:1.5pt" o:hralign="center" o:hrstd="t" o:hr="t" fillcolor="#a0a0a0" stroked="f"/>
+          <v:rect id="_x0000_i1029" style="width:0;height:1.5pt" o:hralign="center" o:hrstd="t" o:hr="t" fillcolor="#a0a0a0" stroked="f"/>
         </w:pict>
       </w:r>
     </w:p>
@@ -878,7 +878,7 @@
     <w:p>
       <w:r>
         <w:pict w14:anchorId="5AB20035">
-          <v:rect id="_x0000_i1090" style="width:0;height:1.5pt" o:hralign="center" o:hrstd="t" o:hr="t" fillcolor="#a0a0a0" stroked="f"/>
+          <v:rect id="_x0000_i1030" style="width:0;height:1.5pt" o:hralign="center" o:hrstd="t" o:hr="t" fillcolor="#a0a0a0" stroked="f"/>
         </w:pict>
       </w:r>
     </w:p>
@@ -973,7 +973,7 @@
     <w:p>
       <w:r>
         <w:pict w14:anchorId="79BEE46A">
-          <v:rect id="_x0000_i1091" style="width:0;height:1.5pt" o:hralign="center" o:hrstd="t" o:hr="t" fillcolor="#a0a0a0" stroked="f"/>
+          <v:rect id="_x0000_i1031" style="width:0;height:1.5pt" o:hralign="center" o:hrstd="t" o:hr="t" fillcolor="#a0a0a0" stroked="f"/>
         </w:pict>
       </w:r>
     </w:p>
@@ -1055,7 +1055,7 @@
     <w:p>
       <w:r>
         <w:pict w14:anchorId="2B4DBDAE">
-          <v:rect id="_x0000_i1092" style="width:0;height:1.5pt" o:hralign="center" o:hrstd="t" o:hr="t" fillcolor="#a0a0a0" stroked="f"/>
+          <v:rect id="_x0000_i1032" style="width:0;height:1.5pt" o:hralign="center" o:hrstd="t" o:hr="t" fillcolor="#a0a0a0" stroked="f"/>
         </w:pict>
       </w:r>
     </w:p>
@@ -1107,7 +1107,7 @@
     <w:p>
       <w:r>
         <w:pict w14:anchorId="607289C3">
-          <v:rect id="_x0000_i1093" style="width:0;height:1.5pt" o:hralign="center" o:hrstd="t" o:hr="t" fillcolor="#a0a0a0" stroked="f"/>
+          <v:rect id="_x0000_i1033" style="width:0;height:1.5pt" o:hralign="center" o:hrstd="t" o:hr="t" fillcolor="#a0a0a0" stroked="f"/>
         </w:pict>
       </w:r>
     </w:p>
@@ -1169,7 +1169,7 @@
     <w:p>
       <w:r>
         <w:pict w14:anchorId="251BD79B">
-          <v:rect id="_x0000_i1094" style="width:0;height:1.5pt" o:hralign="center" o:hrstd="t" o:hr="t" fillcolor="#a0a0a0" stroked="f"/>
+          <v:rect id="_x0000_i1034" style="width:0;height:1.5pt" o:hralign="center" o:hrstd="t" o:hr="t" fillcolor="#a0a0a0" stroked="f"/>
         </w:pict>
       </w:r>
     </w:p>
@@ -1331,6 +1331,47 @@
         <w:t xml:space="preserve"> problems, where evaluation is often much harder than model development itself.</w:t>
       </w:r>
     </w:p>
+    <w:p>
+      <w:r>
+        <w:lastRenderedPageBreak/>
+        <w:drawing>
+          <wp:inline distT="0" distB="0" distL="0" distR="0" wp14:anchorId="4FD83368" wp14:editId="44C53F46">
+            <wp:extent cx="5731510" cy="2809875"/>
+            <wp:effectExtent l="0" t="0" r="2540" b="9525"/>
+            <wp:docPr id="2110939616" name="Picture 1"/>
+            <wp:cNvGraphicFramePr>
+              <a:graphicFrameLocks xmlns:a="http://schemas.openxmlformats.org/drawingml/2006/main" noChangeAspect="1"/>
+            </wp:cNvGraphicFramePr>
+            <a:graphic xmlns:a="http://schemas.openxmlformats.org/drawingml/2006/main">
+              <a:graphicData uri="http://schemas.openxmlformats.org/drawingml/2006/picture">
+                <pic:pic xmlns:pic="http://schemas.openxmlformats.org/drawingml/2006/picture">
+                  <pic:nvPicPr>
+                    <pic:cNvPr id="2110939616" name=""/>
+                    <pic:cNvPicPr/>
+                  </pic:nvPicPr>
+                  <pic:blipFill>
+                    <a:blip r:embed="rId10"/>
+                    <a:stretch>
+                      <a:fillRect/>
+                    </a:stretch>
+                  </pic:blipFill>
+                  <pic:spPr>
+                    <a:xfrm>
+                      <a:off x="0" y="0"/>
+                      <a:ext cx="5731510" cy="2809875"/>
+                    </a:xfrm>
+                    <a:prstGeom prst="rect">
+                      <a:avLst/>
+                    </a:prstGeom>
+                  </pic:spPr>
+                </pic:pic>
+              </a:graphicData>
+            </a:graphic>
+          </wp:inline>
+        </w:drawing>
+      </w:r>
+    </w:p>
+    <w:p/>
     <w:p/>
     <w:sectPr>
       <w:pgSz w:w="11906" w:h="16838"/>
@@ -1343,7 +1384,7 @@
 </file>
 
 <file path=word/numbering.xml><?xml version="1.0" encoding="utf-8"?>
-<w:numbering xmlns:wpc="http://schemas.microsoft.com/office/word/2010/wordprocessingCanvas" xmlns:cx="http://schemas.microsoft.com/office/drawing/2014/chartex" xmlns:cx1="http://schemas.microsoft.com/office/drawing/2015/9/8/chartex" xmlns:cx2="http://schemas.microsoft.com/office/drawing/2015/10/21/chartex" xmlns:cx3="http://schemas.microsoft.com/office/drawing/2016/5/9/chartex" xmlns:cx4="http://schemas.microsoft.com/office/drawing/2016/5/10/chartex" xmlns:cx5="http://schemas.microsoft.com/office/drawing/2016/5/11/chartex" xmlns:cx6="http://schemas.microsoft.com/office/drawing/2016/5/12/chartex" xmlns:cx7="http://schemas.microsoft.com/office/drawing/2016/5/13/chartex" xmlns:cx8="http://schemas.microsoft.com/office/drawing/2016/5/14/chartex" xmlns:mc="http://schemas.openxmlformats.org/markup-compatibility/2006" xmlns:aink="http://schemas.microsoft.com/office/drawing/2016/ink" xmlns:am3d="http://schemas.microsoft.com/office/drawing/2017/model3d" xmlns:o="urn:schemas-microsoft-com:office:office" xmlns:oel="http://schemas.microsoft.com/office/2019/extlst" xmlns:r="http://schemas.openxmlformats.org/officeDocument/2006/relationships" xmlns:m="http://schemas.openxmlformats.org/officeDocument/2006/math" xmlns:v="urn:schemas-microsoft-com:vml" xmlns:wp14="http://schemas.microsoft.com/office/word/2010/wordprocessingDrawing" xmlns:wp="http://schemas.openxmlformats.org/drawingml/2006/wordprocessingDrawing" xmlns:w10="urn:schemas-microsoft-com:office:word" xmlns:w="http://schemas.openxmlformats.org/wordprocessingml/2006/main" xmlns:w14="http://schemas.microsoft.com/office/word/2010/wordml" xmlns:w15="http://schemas.microsoft.com/office/word/2012/wordml" xmlns:w16cex="http://schemas.microsoft.com/office/word/2018/wordml/cex" xmlns:w16cid="http://schemas.microsoft.com/office/word/2016/wordml/cid" xmlns:w16="http://schemas.microsoft.com/office/word/2018/wordml" xmlns:w16du="http://schemas.microsoft.com/office/word/2023/wordml/word16du" xmlns:w16sdtdh="http://schemas.microsoft.com/office/word/2020/wordml/sdtdatahash" xmlns:w16sdtfl="http://schemas.microsoft.com/office/word/2024/wordml/sdtformatlock" xmlns:w16se="http://schemas.microsoft.com/office/word/2015/wordml/symex" xmlns:wpg="http://schemas.microsoft.com/office/word/2010/wordprocessingGroup" xmlns:wpi="http://schemas.microsoft.com/office/word/2010/wordprocessingInk" xmlns:wne="http://schemas.microsoft.com/office/word/2006/wordml" xmlns:wps="http://schemas.microsoft.com/office/word/2010/wordprocessingShape" mc:Ignorable="w14 w15 w16se w16cid w16 w16cex w16sdtdh w16sdtfl w16du wp14">
+<w:numbering xmlns:wpc="http://schemas.microsoft.com/office/word/2010/wordprocessingCanvas" xmlns:cx="http://schemas.microsoft.com/office/drawing/2014/chartex" xmlns:cx1="http://schemas.microsoft.com/office/drawing/2015/9/8/chartex" xmlns:cx2="http://schemas.microsoft.com/office/drawing/2015/10/21/chartex" xmlns:cx3="http://schemas.microsoft.com/office/drawing/2016/5/9/chartex" xmlns:cx4="http://schemas.microsoft.com/office/drawing/2016/5/10/chartex" xmlns:cx5="http://schemas.microsoft.com/office/drawing/2016/5/11/chartex" xmlns:cx6="http://schemas.microsoft.com/office/drawing/2016/5/12/chartex" xmlns:cx7="http://schemas.microsoft.com/office/drawing/2016/5/13/chartex" xmlns:cx8="http://schemas.microsoft.com/office/drawing/2016/5/14/chartex" xmlns:mc="http://schemas.openxmlformats.org/markup-compatibility/2006" xmlns:aink="http://schemas.microsoft.com/office/drawing/2016/ink" xmlns:am3d="http://schemas.microsoft.com/office/drawing/2017/model3d" xmlns:o="urn:schemas-microsoft-com:office:office" xmlns:oel="http://schemas.microsoft.com/office/2019/extlst" xmlns:r="http://schemas.openxmlformats.org/officeDocument/2006/relationships" xmlns:m="http://schemas.openxmlformats.org/officeDocument/2006/math" xmlns:v="urn:schemas-microsoft-com:vml" xmlns:wp14="http://schemas.microsoft.com/office/word/2010/wordprocessingDrawing" xmlns:wp="http://schemas.openxmlformats.org/drawingml/2006/wordprocessingDrawing" xmlns:w10="urn:schemas-microsoft-com:office:word" xmlns:w="http://schemas.openxmlformats.org/wordprocessingml/2006/main" xmlns:w14="http://schemas.microsoft.com/office/word/2010/wordml" xmlns:w15="http://schemas.microsoft.com/office/word/2012/wordml" xmlns:w16cei="http://schemas.microsoft.com/office/word/2026/wordml/cei" xmlns:w16cex="http://schemas.microsoft.com/office/word/2018/wordml/cex" xmlns:w16cid="http://schemas.microsoft.com/office/word/2016/wordml/cid" xmlns:w16="http://schemas.microsoft.com/office/word/2018/wordml" xmlns:w16du="http://schemas.microsoft.com/office/word/2023/wordml/word16du" xmlns:w16sdtdh="http://schemas.microsoft.com/office/word/2020/wordml/sdtdatahash" xmlns:w16sdtfl="http://schemas.microsoft.com/office/word/2024/wordml/sdtformatlock" xmlns:w16se="http://schemas.microsoft.com/office/word/2015/wordml/symex" xmlns:wpg="http://schemas.microsoft.com/office/word/2010/wordprocessingGroup" xmlns:wpi="http://schemas.microsoft.com/office/word/2010/wordprocessingInk" xmlns:wne="http://schemas.microsoft.com/office/word/2006/wordml" xmlns:wps="http://schemas.microsoft.com/office/word/2010/wordprocessingShape" mc:Ignorable="w14 w15 w16se w16cid w16 w16cex w16sdtdh w16sdtfl w16du wp14">
   <w:abstractNum w:abstractNumId="0" w15:restartNumberingAfterBreak="0">
     <w:nsid w:val="08D91845"/>
     <w:multiLevelType w:val="multilevel"/>
@@ -2558,6 +2599,7 @@
   <w:style w:type="character" w:default="1" w:styleId="DefaultParagraphFont">
     <w:name w:val="Default Paragraph Font"/>
     <w:uiPriority w:val="1"/>
+    <w:semiHidden/>
     <w:unhideWhenUsed/>
   </w:style>
   <w:style w:type="table" w:default="1" w:styleId="TableNormal">

</xml_diff>